<commit_message>
Ronda 3: resolución de imágenes, alineación izquierda, correo del asesor
- El pixelado de Fig. 1/Fig. 2 no era de resolución de origen (los PNG ya son de
  2725x2114 y 5322x1925) sino de soffice --convert-to pdf comprimiendo a JPEG de
  300dpi por defecto. Documentado en el docstring del script el comando correcto
  de exportación (writer_pdf_Export con ReduceImageResolution:false) — sin
  cambios de código en fill_report.py para esto, es un paso del flujo de trabajo.
- Tablas: se agrega w:tblInd=0 explícito junto al w:jc=left que ya existía, como
  salvaguarda extra de alineación en Word.
- Figuras: alineación de imagen y caption cambiada de centrado a izquierda.
- Correo del asesor: mario.ruz@academicos.udg.mx (el institucional, según la
  propia inclinación del usuario entre las dos opciones que dio).

Co-Authored-By: Claude Sonnet 5 <noreply@anthropic.com>
</commit_message>
<xml_diff>
--- a/docs/criteria/ReporteArgusINCO_final.docx
+++ b/docs/criteria/ReporteArgusINCO_final.docx
@@ -97,7 +97,7 @@
           <w:sz w:val="18"/>
           <w:szCs w:val="18"/>
         </w:rPr>
-        <w:t>[correo del asesor — completar]</w:t>
+        <w:t>mario.ruz@academicos.udg.mx</w:t>
       </w:r>
     </w:p>
     <w:p>
@@ -428,6 +428,7 @@
         <w:tblLayout w:type="fixed"/>
         <w:tblLook w:firstColumn="1" w:firstRow="1" w:lastColumn="0" w:lastRow="0" w:noHBand="0" w:noVBand="1" w:val="04A0"/>
         <w:jc w:val="left"/>
+        <w:tblInd w:type="dxa" w:w="0"/>
       </w:tblPr>
       <w:tblGrid>
         <w:gridCol w:w="360"/>
@@ -862,6 +863,7 @@
         <w:tblLayout w:type="fixed"/>
         <w:tblLook w:firstColumn="1" w:firstRow="1" w:lastColumn="0" w:lastRow="0" w:noHBand="0" w:noVBand="1" w:val="04A0"/>
         <w:jc w:val="left"/>
+        <w:tblInd w:type="dxa" w:w="0"/>
       </w:tblPr>
       <w:tblGrid>
         <w:gridCol w:w="504"/>
@@ -1553,7 +1555,7 @@
     </w:p>
     <w:p>
       <w:pPr>
-        <w:jc w:val="center"/>
+        <w:jc w:val="left"/>
       </w:pPr>
       <w:r>
         <w:drawing>
@@ -1592,7 +1594,7 @@
     </w:p>
     <w:p>
       <w:pPr>
-        <w:jc w:val="center"/>
+        <w:jc w:val="left"/>
       </w:pPr>
       <w:r>
         <w:rPr>
@@ -1627,6 +1629,7 @@
         <w:tblLayout w:type="fixed"/>
         <w:tblLook w:firstColumn="1" w:firstRow="1" w:lastColumn="0" w:lastRow="0" w:noHBand="0" w:noVBand="1" w:val="04A0"/>
         <w:jc w:val="left"/>
+        <w:tblInd w:type="dxa" w:w="0"/>
       </w:tblPr>
       <w:tblGrid>
         <w:gridCol w:w="1512"/>
@@ -2341,7 +2344,7 @@
     </w:p>
     <w:p>
       <w:pPr>
-        <w:jc w:val="center"/>
+        <w:jc w:val="left"/>
       </w:pPr>
       <w:r>
         <w:drawing>
@@ -2380,7 +2383,7 @@
     </w:p>
     <w:p>
       <w:pPr>
-        <w:jc w:val="center"/>
+        <w:jc w:val="left"/>
       </w:pPr>
       <w:r>
         <w:rPr>

</xml_diff>

<commit_message>
Cambiar el texto de firma por una línea en blanco real
FIRMA DE VISTO BUENO DEL ASESOR venía de la plantilla como texto en negrita
y subrayado, sin espacio real para firmar encima. Se reemplaza por una línea
en blanco (guiones bajos) con una etiqueta pequeña en cursiva debajo,
siguiendo la convención estándar de líneas de firma.
</commit_message>
<xml_diff>
--- a/docs/criteria/ReporteArgusINCO_final.docx
+++ b/docs/criteria/ReporteArgusINCO_final.docx
@@ -119,12 +119,25 @@
       <w:r>
         <w:rPr>
           <w:rFonts w:ascii="Courier New" w:eastAsia="Courier New" w:hAnsi="Courier New" w:cs="Courier New"/>
-          <w:b/>
+          <w:b w:val="0"/>
           <w:sz w:val="18"/>
           <w:szCs w:val="18"/>
-          <w:u w:val="single"/>
-        </w:rPr>
-        <w:t>FIRMA DE VISTO BUENO DEL ASESOR</w:t>
+          <w:u w:val="none"/>
+        </w:rPr>
+        <w:t>________________________________</w:t>
+      </w:r>
+    </w:p>
+    <w:p>
+      <w:pPr>
+        <w:jc w:val="center"/>
+      </w:pPr>
+      <w:r>
+        <w:rPr>
+          <w:b w:val="0"/>
+          <w:i/>
+          <w:sz w:val="16"/>
+        </w:rPr>
+        <w:t>Firma de Visto Bueno del Asesor</w:t>
       </w:r>
     </w:p>
     <w:p>

</xml_diff>

<commit_message>
Quitar la etiqueta bajo la línea de firma del asesor
A pedido del usuario: se deja solo la línea en blanco, sin el texto
"Firma de Visto Bueno del Asesor" debajo.
</commit_message>
<xml_diff>
--- a/docs/criteria/ReporteArgusINCO_final.docx
+++ b/docs/criteria/ReporteArgusINCO_final.docx
@@ -125,19 +125,6 @@
           <w:u w:val="none"/>
         </w:rPr>
         <w:t>________________________________</w:t>
-      </w:r>
-    </w:p>
-    <w:p>
-      <w:pPr>
-        <w:jc w:val="center"/>
-      </w:pPr>
-      <w:r>
-        <w:rPr>
-          <w:b w:val="0"/>
-          <w:i/>
-          <w:sz w:val="16"/>
-        </w:rPr>
-        <w:t>Firma de Visto Bueno del Asesor</w:t>
       </w:r>
     </w:p>
     <w:p>

</xml_diff>

<commit_message>
Achicar Fig. 2 para que no se corte por la derecha en Word
Fig. 2 (cnn-lstm-mediapipe-pipeline.png) tiene una relación de aspecto muy
ancha (2.77:1) vs. Fig. 1 (1.29:1) — al mismo ancho de 2.6in dejaba muy poco
margen a la derecha dentro de la columna en Word (no reproducible en el PDF
de LibreOffice, mismo patrón visto ya varias veces en este documento).
Reducida a 2.15in de ancho.
</commit_message>
<xml_diff>
--- a/docs/criteria/ReporteArgusINCO_final.docx
+++ b/docs/criteria/ReporteArgusINCO_final.docx
@@ -2349,7 +2349,7 @@
       <w:r>
         <w:drawing>
           <wp:inline xmlns:a="http://schemas.openxmlformats.org/drawingml/2006/main" xmlns:pic="http://schemas.openxmlformats.org/drawingml/2006/picture">
-            <wp:extent cx="2377440" cy="859935"/>
+            <wp:extent cx="1965960" cy="711100"/>
             <wp:docPr id="5" name="Picture 5"/>
             <wp:cNvGraphicFramePr>
               <a:graphicFrameLocks noChangeAspect="1"/>
@@ -2370,7 +2370,7 @@
                   <pic:spPr>
                     <a:xfrm>
                       <a:off x="0" y="0"/>
-                      <a:ext cx="2377440" cy="859935"/>
+                      <a:ext cx="1965960" cy="711100"/>
                     </a:xfrm>
                     <a:prstGeom prst="rect"/>
                   </pic:spPr>

</xml_diff>

<commit_message>
Agregar encabezado faltante TABLA III (comparación de modelos)
El texto refería "Tabla III" tres veces pero la tabla insertada en la
sección III-E no tenía el título "TABLA III" / caption por encima, a
diferencia de la Tabla I y la Tabla II que sí lo tienen. Se agrega el
mismo patrón (Heading 3 "TABLA III" + caption Normal 8pt centrado)
usado para las otras dos tablas.
</commit_message>
<xml_diff>
--- a/docs/criteria/ReporteArgusINCO_final.docx
+++ b/docs/criteria/ReporteArgusINCO_final.docx
@@ -1620,6 +1620,25 @@
       </w:pPr>
       <w:r>
         <w:t>Se comparó un conjunto de arquitecturas sobre el mismo problema binario (Not Drowsy / Drowsy), resumido en la Tabla III: RandomForest y una red densa sobre features de un solo frame quedaron topadas en 33–41% de accuracy (correlación de Spearman máxima |r|=0.26 entre cualquier feature de un solo frame y el nivel de somnolencia); una CNN sobre el recorte facial completo subió a 59.64% / 0.5273 F1 macro; y el modelo final — el embedding congelado de esa CNN fusionado con features geométricas y alimentado a una LSTM sobre una ventana de hasta 100 frames — alcanzó 84.24% accuracy / 0.8375 F1 macro. División train/val/test agrupada por sujeto (StratifiedGroupKFold) en todos los casos.</w:t>
+      </w:r>
+    </w:p>
+    <w:p>
+      <w:pPr>
+        <w:pStyle w:val="Ttulo3"/>
+      </w:pPr>
+      <w:r>
+        <w:t>TABLA III</w:t>
+      </w:r>
+    </w:p>
+    <w:p>
+      <w:pPr>
+        <w:jc w:val="center"/>
+      </w:pPr>
+      <w:r>
+        <w:rPr>
+          <w:sz w:val="16"/>
+        </w:rPr>
+        <w:t>COMPARACIÓN DE ARQUITECTURAS DE MODELO</w:t>
       </w:r>
     </w:p>
     <w:tbl>

</xml_diff>